<commit_message>
Finalize lifecycle examples, add transformation subtext per step
Pressure-tested all 18 picks against each step's scope: Amplitude, Simile
and Dovetail for Ideation; mabl for Test & QA; Datadog and Resolve AI for
Monitor. Adds a sourced subtext line per step, matches the latest box
layout, and updates the companion doc with verified write-ups.

Co-Authored-By: Claude Opus 5.5 <noreply@anthropic.com>
Claude-Session: https://claude.ai/code/session_016pZrFg88ZxhyGaoGABrsrw
</commit_message>
<xml_diff>
--- a/slides/ai-devops-lifecycle/AI_Product_Lifecycle_Companies.docx
+++ b/slides/ai-devops-lifecycle/AI_Product_Lifecycle_Companies.docx
@@ -32,7 +32,7 @@
           <w:sz w:val="20"/>
           <w:szCs w:val="20"/>
         </w:rPr>
-        <w:t xml:space="preserve">Software development case study for the Employee Perspective section, aligned to the six-step product development lifecycle on the slide. Each step lists the platform incumbent, the best-funded challenger and a niche pick, with what each is doing and how it is funded. As of October 13, 2026. Ideation &amp; Roadmapping, Build, Test &amp; QA and Launch &amp; Monitor reuse the October 12 DevOps working doc (its Plan, Code, Test and Monitor stages); Product Definition and Design are new research, with sources listed at the end.</w:t>
+        <w:t xml:space="preserve">Software development case study for the Employee Perspective section, aligned to the six-step product development lifecycle on the slide. Each step opens with how AI is transforming it, then lists the platform incumbent, the best-funded challenger and a niche pick, with what each is doing and how it is funded. As of October 13, 2026; every figure was checked against the source listed at the end. Changes from the October 12 DevOps working doc are summarized in the closing notes.</w:t>
       </w:r>
     </w:p>
     <w:p>
@@ -68,23 +68,23 @@
           <w:sz w:val="20"/>
           <w:szCs w:val="20"/>
         </w:rPr>
-        <w:t xml:space="preserve">Shift: From writing tickets for humans to writing specs and goals that agents execute.</w:t>
-      </w:r>
-    </w:p>
-    <w:p>
-      <w:pPr>
-        <w:keepNext/>
-        <w:spacing w:after="20" w:before="100"/>
-      </w:pPr>
-      <w:r>
-        <w:rPr>
-          <w:rFonts w:ascii="Arial" w:cs="Arial" w:eastAsia="Arial" w:hAnsi="Arial"/>
-          <w:b/>
-          <w:bCs/>
-          <w:sz w:val="20"/>
-          <w:szCs w:val="20"/>
-        </w:rPr>
-        <w:t xml:space="preserve">Atlassian</w:t>
+        <w:t xml:space="preserve">Shift: From weeks of manual research to agents that query usage data in plain language, synthesize feedback and simulate customers; 69% of people running user research now use AI in at least some projects (Maze, Future of User Research 2026).</w:t>
+      </w:r>
+    </w:p>
+    <w:p>
+      <w:pPr>
+        <w:keepNext/>
+        <w:spacing w:after="20" w:before="100"/>
+      </w:pPr>
+      <w:r>
+        <w:rPr>
+          <w:rFonts w:ascii="Arial" w:cs="Arial" w:eastAsia="Arial" w:hAnsi="Arial"/>
+          <w:b/>
+          <w:bCs/>
+          <w:sz w:val="20"/>
+          <w:szCs w:val="20"/>
+        </w:rPr>
+        <w:t xml:space="preserve">Amplitude</w:t>
       </w:r>
       <w:r>
         <w:rPr>
@@ -107,23 +107,23 @@
           <w:sz w:val="20"/>
           <w:szCs w:val="20"/>
         </w:rPr>
-        <w:t xml:space="preserve">Jira plus Rovo: Agents in Jira went GA at Team '26, and Rovo Dev Agents turn Jira issues into code plans, generate code and review PRs back into the ticket. Public company; Teamwork Collection, its AI monetization vehicle, passed 1M seats and 1,000 customers in Q2 FY26, and Rovo customers grow ARR at roughly twice the rate of non-Rovo customers.</w:t>
-      </w:r>
-    </w:p>
-    <w:p>
-      <w:pPr>
-        <w:keepNext/>
-        <w:spacing w:after="20" w:before="100"/>
-      </w:pPr>
-      <w:r>
-        <w:rPr>
-          <w:rFonts w:ascii="Arial" w:cs="Arial" w:eastAsia="Arial" w:hAnsi="Arial"/>
-          <w:b/>
-          <w:bCs/>
-          <w:sz w:val="20"/>
-          <w:szCs w:val="20"/>
-        </w:rPr>
-        <w:t xml:space="preserve">AWS Kiro</w:t>
+        <w:t xml:space="preserve">The product-analytics incumbent, now bringing agents into discovery: Global Agent (February 2026) answers product-usage questions asked in plain language, and the AI Feedback Agent turns survey and support-ticket feedback into themes mapped to actual user behavior. Wave, introduced in Q2 2026, continuously analyzes signals across analytics, session replays, feedback and experiments, and its Opportunities feature (Early Access) scores problems and growth opportunities and generates specs for humans or coding agents. Public company; $410M of ARR in Q2 2026, up 22%, and more than 5,200 paying customers including Atlassian, Burger King, NBCUniversal and Square.</w:t>
+      </w:r>
+    </w:p>
+    <w:p>
+      <w:pPr>
+        <w:keepNext/>
+        <w:spacing w:after="20" w:before="100"/>
+      </w:pPr>
+      <w:r>
+        <w:rPr>
+          <w:rFonts w:ascii="Arial" w:cs="Arial" w:eastAsia="Arial" w:hAnsi="Arial"/>
+          <w:b/>
+          <w:bCs/>
+          <w:sz w:val="20"/>
+          <w:szCs w:val="20"/>
+        </w:rPr>
+        <w:t xml:space="preserve">Simile</w:t>
       </w:r>
       <w:r>
         <w:rPr>
@@ -146,23 +146,23 @@
           <w:sz w:val="20"/>
           <w:szCs w:val="20"/>
         </w:rPr>
-        <w:t xml:space="preserve">A spec-driven agentic IDE (requirements, design, tasks, then code) that went GA in 2026 as the replacement for Amazon Q Developer, with Design-first and Bugfix modes added after most developers resisted spec-first work. Funded internally by AWS.</w:t>
-      </w:r>
-    </w:p>
-    <w:p>
-      <w:pPr>
-        <w:keepNext/>
-        <w:spacing w:after="20" w:before="100"/>
-      </w:pPr>
-      <w:r>
-        <w:rPr>
-          <w:rFonts w:ascii="Arial" w:cs="Arial" w:eastAsia="Arial" w:hAnsi="Arial"/>
-          <w:b/>
-          <w:bCs/>
-          <w:sz w:val="20"/>
-          <w:szCs w:val="20"/>
-        </w:rPr>
-        <w:t xml:space="preserve">Tessl</w:t>
+        <w:t xml:space="preserve">An AI-native simulation company whose simulated customers let teams pre-test product ideas, launches and experiences before going to real users; it says its foundation model for human behavior has run tens of millions of simulations for Fortune 100 enterprises. Emerged from stealth in February 2026 backed by $100M led by Index Ventures, then raised over $200M at a $2B post-money valuation in July 2026, co-led by Greenoaks and Index. Customers include CVS Health, Wealthfront, Deloitte and Gallup, and Itaú Unibanco used it to complete a five-week research cycle in four business days. Its 5x revenue growth since launch is company-reported, with no revenue figure disclosed; it sells to market-research and CX teams as much as to product teams.</w:t>
+      </w:r>
+    </w:p>
+    <w:p>
+      <w:pPr>
+        <w:keepNext/>
+        <w:spacing w:after="20" w:before="100"/>
+      </w:pPr>
+      <w:r>
+        <w:rPr>
+          <w:rFonts w:ascii="Arial" w:cs="Arial" w:eastAsia="Arial" w:hAnsi="Arial"/>
+          <w:b/>
+          <w:bCs/>
+          <w:sz w:val="20"/>
+          <w:szCs w:val="20"/>
+        </w:rPr>
+        <w:t xml:space="preserve">Dovetail</w:t>
       </w:r>
       <w:r>
         <w:rPr>
@@ -185,7 +185,7 @@
           <w:sz w:val="20"/>
           <w:szCs w:val="20"/>
         </w:rPr>
-        <w:t xml:space="preserve">Snyk founder Guy Podjarny's spec-as-source platform: a Spec Registry of 10,000+ library specs, a spec-first framework (still in closed beta) and, since January 2026, a package manager for agent skills. Raised $125M (a $25M seed from boldstart and GV, then a $100M Series A led by Index with Accel) at a reported ~$750M valuation.</w:t>
+        <w:t xml:space="preserve">A customer-research specialist that synthesizes interviews, calls and tickets, relaunched as an AI-first customer intelligence platform in October 2025 and expanded in July 2026. New Digital Twins, built from real calls, tickets and research, let teams question a simulated customer, segment or persona, and Channels 2.0 (beta) gives a 360-degree view of feedback and turns it into evidence-backed ideas. Says it is used by 40% of the Fortune 500, naming AWS, Visa and Breville as enterprise customers; its last disclosed funding was a $63M Series A led by Accel in January 2022 at a valuation above $700M.</w:t>
       </w:r>
     </w:p>
     <w:p>
@@ -221,7 +221,7 @@
           <w:sz w:val="20"/>
           <w:szCs w:val="20"/>
         </w:rPr>
-        <w:t xml:space="preserve">Shift: From hand-written PRDs to specs that AI drafts from customer feedback and notes, and that coding agents then read directly as context.</w:t>
+        <w:t xml:space="preserve">Shift: From hand-written PRDs to AI-drafted specs grounded in customer feedback and the codebase, then handed straight to coding agents; writing PRDs is where PMs report getting the most value from AI tools (Lenny's Newsletter survey, December 2025).</w:t>
       </w:r>
     </w:p>
     <w:p>
@@ -260,7 +260,7 @@
           <w:sz w:val="20"/>
           <w:szCs w:val="20"/>
         </w:rPr>
-        <w:t xml:space="preserve">A long-established product-management platform (founded 2014), now adding Productboard Spark, an AI agent that turns a product opportunity into a delivery-ready spec using customer feedback pulled from tools such as Zendesk, Gong and Intercom. Spark was announced as a private beta in October 2025, opened as a public beta on January 27, 2026 and is now generally available; an MCP server followed in mid-2026, and since September 2026 specs can be pushed straight to external coding tools (a Labs feature). Privately held; 6,000+ customers, including Zoom, Microsoft and Salesforce.</w:t>
+        <w:t xml:space="preserve">A product-management platform (founded 2014) that relaunched in June 2026 as an AI-native product system around Spark, now generally available. Spark drafts delivery-ready specs grounded in customer feedback from tools such as Zendesk, Gong and Intercom and in a connected GitHub repository, so specs reflect the codebase's architecture and constraints; specs can then be pulled into Claude Code, Codex or Cursor through a new MCP server (beta). 6,000+ customers; privately held, last raising a $125M Series D in February 2022 that took total funding to $262M at a $1.725B valuation.</w:t>
       </w:r>
     </w:p>
     <w:p>
@@ -299,7 +299,7 @@
           <w:sz w:val="20"/>
           <w:szCs w:val="20"/>
         </w:rPr>
-        <w:t xml:space="preserve">An issue tracker and product-planning tool rebuilt around agents: in the project composer (September 2026) the Linear Agent helps develop an idea and sharpen the brief before a project goes live, and Loops (July 2026) turns unstructured notes such as meeting transcripts into coordinated follow-up work. Agents, Linear's own and third-party, are installed in 95% of paid workspaces and now create 50% of the work in Linear, up from 3% a year earlier. Privately held; past $100M ARR with 177% net revenue retention and 40,000+ paying companies, and valued at $2.5B in a $99M employee tender offer in August 2026 (a secondary sale, not new capital). Founded in 2019, so AI-forward rather than AI-born; in our search no PM-focused AI-native PRD startup came close to this scale, and the best-funded spec startup, Tessl ($125M), targets developers.</w:t>
+        <w:t xml:space="preserve">An issue tracker repositioned as a platform for agent-driven product development. Linear Agent (launched in public beta in March 2026) extracts common requirements from customer requests and scopes a starting spec, Code Intelligence (May 2026) answers which technical constraints should shape a plan, and the project composer (September 2026) lets PMs sharpen a brief with the agent before a project goes live. Past $100M ARR with 40,000+ paying companies and 177% net revenue retention; agents are installed in 95% of paid workspaces and create 50% of new work, up from 3% a year earlier. Valued at $2.5B in a $99M employee tender in August 2026 (a secondary sale, not new capital). Founded in 2019, so AI-first rather than AI-born; no PRD-focused AI-native startup has raised at comparable scale.</w:t>
       </w:r>
     </w:p>
     <w:p>
@@ -338,7 +338,7 @@
           <w:sz w:val="20"/>
           <w:szCs w:val="20"/>
         </w:rPr>
-        <w:t xml:space="preserve">A PRD specialist founded by Claire Vo in 2023 that turns rough ideas, meeting notes or a single prompt into PRDs, user stories, technical specs and go-to-market briefs, and reviews and improves existing docs; documents can be used inside Cursor, VS Code and Claude via MCP. Bootstrapped, with no disclosed funding. The company claims 250,000+ product managers and 1M+ documents created, up from a reported 100,000+ PMs and 750,000+ documents in June 2026; these are company figures, not independently verified.</w:t>
+        <w:t xml:space="preserve">A PRD specialist that turns rough ideas, meeting notes or a single prompt into PRDs, user stories, tech specs and launch briefs, and gives CPO-level feedback on existing documents. It pulls context from Notion, Linear, GitHub and Slack, works inside Cursor, VS Code and Claude via MCP, and added API and MCP template tools in October 2026 so product documents can feed AI workflows. Founded by Claire Vo and run bootstrapped and profitable without venture capital; the company claims 250,000+ product managers and 1M+ documents created (unaudited).</w:t>
       </w:r>
     </w:p>
     <w:p>
@@ -374,7 +374,7 @@
           <w:sz w:val="20"/>
           <w:szCs w:val="20"/>
         </w:rPr>
-        <w:t xml:space="preserve">Shift: From static mockups to prompts that produce clickable, testable prototypes, increasingly built from a team's real design system and handed straight to coding agents.</w:t>
+        <w:t xml:space="preserve">Shift: From static mockups to prompt-built, testable prototypes made from a team's own components; over half of Figma's customers paying more than $10,000 a year were using its AI agent weekly by July 31, 2026 (Figma Q2 2026 results).</w:t>
       </w:r>
     </w:p>
     <w:p>
@@ -413,7 +413,7 @@
           <w:sz w:val="20"/>
           <w:szCs w:val="20"/>
         </w:rPr>
-        <w:t xml:space="preserve">The design platform used by 95% of the Fortune 500 (March 2025, per its IPO prospectus), now adding AI across the canvas: Figma Make generates working app prototypes from prompts, Code Layers (announced June 2026 and rolling out as a closed beta) bring Make onto the design canvas, and the Figma agent is a first-party agent built into the canvas. Public company; as of June 30, 2026, over 80% of paid customers with more than $10,000 in ARR were consuming AI credits weekly, and by July 31 over 50% of them were using the Figma agent weekly. 1,635 customers pay more than $100,000 a year (Q2 2026 results).</w:t>
+        <w:t xml:space="preserve">The design platform used by 95% of the Fortune 500 (March 2025, per its IPO prospectus), now putting AI across the canvas. Figma Make, available to all since July 2025, turns prompts into interactive, high-fidelity prototypes; the Figma agent (beta from May 2026, generally available since October 6, 2026) explores design directions starting from a team's own components and can review task flows from simulated user perspectives, flagging confusion points and accessibility issues. Public company; Q2 2026 revenue of $370.1M, up 48%, with 1,635 customers paying more than $100,000 a year. Over 80% of paid customers above $10,000 in ARR were consuming AI credits weekly at June 30, 2026, and over half were using the Figma agent weekly by July 31.</w:t>
       </w:r>
     </w:p>
     <w:p>
@@ -452,7 +452,7 @@
           <w:sz w:val="20"/>
           <w:szCs w:val="20"/>
         </w:rPr>
-        <w:t xml:space="preserve">An AI app builder that turns plain-language prompts into working, shareable full-stack apps, used for prototyping and increasingly for internal tools; Zendesk's senior director of product says it went from a faster way to prototype to an important tool for building internal products. Raised a $400M Series C at a $13.3B valuation in August 2026, led by Menlo Ventures and co-led by the EU-backed Scaleup Europe Fund, managed by EQT; users have created more than 60M projects. The company says its annualized revenue run rate passed $600M in September 2026, up from $500M in June (co-founder statements to TechCrunch, unaudited).</w:t>
+        <w:t xml:space="preserve">An AI-native app builder whose prototypes product lets PMs and designers build shareable, working prototypes without engineers, reading context from Jira, Confluence, Notion or Linear tickets; n8n's PM team replaced its wireframing process with it, and Zendesk's senior director of product says it went from a faster way to prototype to an important tool for building internal products. Raised a $400M Series C at a $13.3B valuation in August 2026, led by Menlo Ventures and co-led by the EU-backed Scaleup Europe Fund, managed by EQT; more than 60M projects have been created and it reaches employees at nearly two-thirds of the Fortune 500. Co-founder Fabian Hedin said in September 2026 that revenue had reached $600M (a spoken, unaudited company figure).</w:t>
       </w:r>
     </w:p>
     <w:p>
@@ -491,7 +491,7 @@
           <w:sz w:val="20"/>
           <w:szCs w:val="20"/>
         </w:rPr>
-        <w:t xml:space="preserve">A Y Combinator-backed AI prototyping tool for product teams that builds prototypes from a team's own design system, importing components from Figma, GitHub and Storybook, which fits the slide's dynamic component prototyping example most directly. Agent 2.0 (April 2026) extended the agent, and MagicOS (October 13, 2026) adds an infinite design canvas that hands work to coding agents over MCP. Raised a $6M Series A in November 2025 led by Standard Capital with Y Combinator and Essence VC; 1,500+ product teams, including Granola, Vanta and Freedom Mortgage.</w:t>
+        <w:t xml:space="preserve">A Y Combinator-backed prototyping tool that builds prototypes from a team's own design system, importing components from Figma, GitHub and Storybook, which fits the dynamic component prototyping example most directly. Agent 2.0 (April 2026) added skills, connectors and MCP export to coding agents, and MagicOS (October 13, 2026) adds an infinite canvas for exploring directions and hands the chosen design to Claude Code, Cursor or Codex over MCP. Raised a $6M Series A in November 2025 led by Standard Capital with Y Combinator and Essence VC; 1,500+ product teams, including Granola, Vanta and Freedom Mortgage.</w:t>
       </w:r>
     </w:p>
     <w:p>
@@ -527,7 +527,7 @@
           <w:sz w:val="20"/>
           <w:szCs w:val="20"/>
         </w:rPr>
-        <w:t xml:space="preserve">Shift: Autocomplete to chat to delegated agents running in parallel; the developer reviews rather than types.</w:t>
+        <w:t xml:space="preserve">Shift: Autocomplete to chat to delegated agents running in parallel; the developer reviews rather than types. One in three pull requests on GitHub now involves an agent (Microsoft FY26 Q4 earnings, July 2026).</w:t>
       </w:r>
     </w:p>
     <w:p>
@@ -566,7 +566,7 @@
           <w:sz w:val="20"/>
           <w:szCs w:val="20"/>
         </w:rPr>
-        <w:t xml:space="preserve">Copilot's coding agent turns an assigned issue into a PR, and Agent HQ (April 2026) opens Copilot to agents from OpenAI, Anthropic, Google, Cognition and xAI. 50M Copilot users (15M in April 2025), ~140,000 organizations and one in three PRs on GitHub now involving an agent; all plans moved to usage-based AI credits on June 1, 2026.</w:t>
+        <w:t xml:space="preserve">Copilot's coding agent turns an assigned issue into a PR, and Agent HQ (February 2026) brings Anthropic's Claude and OpenAI's Codex agents into GitHub and VS Code (public preview). 50M Copilot users (15M in April 2025), ~140,000 organizations and one in three PRs on GitHub now involving an agent; all plans moved to usage-based AI credits on June 1, 2026.</w:t>
       </w:r>
     </w:p>
     <w:p>
@@ -680,7 +680,7 @@
           <w:sz w:val="20"/>
           <w:szCs w:val="20"/>
         </w:rPr>
-        <w:t xml:space="preserve">Shift: From hand-scripted suites to autonomous platforms; Forrester renamed the category after most organizations plateaued at 25% test automation.</w:t>
+        <w:t xml:space="preserve">Shift: From hand-scripted suites to agents that write, run and repair tests; Gartner renamed the category Agentic Software Quality Assurance Platforms in 2026; its October 2025 report expected 70% of enterprises to have integrated AI-augmented testing tools by 2028, up from about 20% in early 2025.</w:t>
       </w:r>
     </w:p>
     <w:p>
@@ -719,23 +719,23 @@
           <w:sz w:val="20"/>
           <w:szCs w:val="20"/>
         </w:rPr>
-        <w:t xml:space="preserve">Tosca and Testim under an "agentic quality engineering" platform that adds autonomous test creation, execution and maintenance on top of a large enterprise installed base. A Leader in Forrester's Autonomous Testing Platforms Wave (Q4 2025) and the first Gartner Magic Quadrant for AI-Augmented Software Testing Tools; privately held with roughly $500M of ARR in 2025.</w:t>
-      </w:r>
-    </w:p>
-    <w:p>
-      <w:pPr>
-        <w:keepNext/>
-        <w:spacing w:after="20" w:before="100"/>
-      </w:pPr>
-      <w:r>
-        <w:rPr>
-          <w:rFonts w:ascii="Arial" w:cs="Arial" w:eastAsia="Arial" w:hAnsi="Arial"/>
-          <w:b/>
-          <w:bCs/>
-          <w:sz w:val="20"/>
-          <w:szCs w:val="20"/>
-        </w:rPr>
-        <w:t xml:space="preserve">QA Wolf</w:t>
+        <w:t xml:space="preserve">The testing-first enterprise platform. Its Agentic Quality Engineering Platform (March 2026) adds an AI Workspace that coordinates testing, automation, performance and quality-intelligence agents under governance; Agentic Test Creation in qTest writes test cases from natural language, and agentic test automation runs on Tosca. In July 2026 it acquired Tabnine to give its testing agents enterprise codebase context. A Leader in Gartner's 2026 Magic Quadrant for Agentic Software Quality Assurance Platforms (October 2026), its second straight year as a Leader in the report; privately held with about $500M of ARR in 2025 and 3,000+ customers, including Experian, T-Mobile and Allianz.</w:t>
+      </w:r>
+    </w:p>
+    <w:p>
+      <w:pPr>
+        <w:keepNext/>
+        <w:spacing w:after="20" w:before="100"/>
+      </w:pPr>
+      <w:r>
+        <w:rPr>
+          <w:rFonts w:ascii="Arial" w:cs="Arial" w:eastAsia="Arial" w:hAnsi="Arial"/>
+          <w:b/>
+          <w:bCs/>
+          <w:sz w:val="20"/>
+          <w:szCs w:val="20"/>
+        </w:rPr>
+        <w:t xml:space="preserve">mabl</w:t>
       </w:r>
       <w:r>
         <w:rPr>
@@ -758,7 +758,7 @@
           <w:sz w:val="20"/>
           <w:szCs w:val="20"/>
         </w:rPr>
-        <w:t xml:space="preserve">Coverage-as-a-service: AI explores the application and writes deterministic Playwright and Appium tests that QA Wolf engineers maintain, sold with a guarantee of 80% automated end-to-end coverage. Raised a $36M Series B in February 2026 led by Scale Venture Partners; customers include Salesloft, Metronome and Drata, and it is expanding into native iOS and Android.</w:t>
+        <w:t xml:space="preserve">An AI-native testing company (since 2017) relaunched in April 2026 as an agentic testing platform for enterprise teams: tests are authored in the cloud from a browser, CLI or IDE, AI auto-healing repairs broken tests, and developers can create, edit and run mabl tests from inside their AI coding agent. Named a Challenger in the same October 2026 Gartner Magic Quadrant, its first placement. Has raised $77M, most recently a $40M Series C led by Vista Equity Partners' Endeavor Fund in November 2021; customers include Mercedes-Benz, LendingClub Bank and JetBlue.</w:t>
       </w:r>
     </w:p>
     <w:p>
@@ -797,7 +797,7 @@
           <w:sz w:val="20"/>
           <w:szCs w:val="20"/>
         </w:rPr>
-        <w:t xml:space="preserve">Developer-first AI end-to-end testing that generates whole test cases from plain language, aimed at engineers rather than QA teams. Raised a $15M Series A in November 2025 led by Standard Capital with Dropbox Ventures, after a $3.7M seed from General Catalyst and Y Combinator; customers report reaching 80% coverage in days.</w:t>
+        <w:t xml:space="preserve">Developer-first AI end-to-end testing: teams describe tests in plain English, and since June 2026 Momentic reads each pull request's diff and proposes new or updated tests. In September 2026 it launched Mo, an AI QA engineer that sends hundreds of agents through an app's user flows and records every interaction; across the beta, Mo ran 1,100+ bug bashes and caught 3,500 verified bugs. Raised a $15M Series A in November 2025 led by Standard Capital with Dropbox Ventures; at Notion every engineer runs Momentic tests on every PR, merge and deploy.</w:t>
       </w:r>
     </w:p>
     <w:p>
@@ -833,62 +833,62 @@
           <w:sz w:val="20"/>
           <w:szCs w:val="20"/>
         </w:rPr>
-        <w:t xml:space="preserve">Shift: Product telemetry, LLM evals and engineering telemetry converge; the AI features in the product and the agents in the pipeline both become things to monitor.</w:t>
-      </w:r>
-    </w:p>
-    <w:p>
-      <w:pPr>
-        <w:keepNext/>
-        <w:spacing w:after="20" w:before="100"/>
-      </w:pPr>
-      <w:r>
-        <w:rPr>
-          <w:rFonts w:ascii="Arial" w:cs="Arial" w:eastAsia="Arial" w:hAnsi="Arial"/>
-          <w:b/>
-          <w:bCs/>
-          <w:sz w:val="20"/>
-          <w:szCs w:val="20"/>
-        </w:rPr>
-        <w:t xml:space="preserve">PostHog</w:t>
-      </w:r>
-      <w:r>
-        <w:rPr>
-          <w:rFonts w:ascii="Arial" w:cs="Arial" w:eastAsia="Arial" w:hAnsi="Arial"/>
-          <w:color w:val="006AAE"/>
-          <w:sz w:val="18"/>
-          <w:szCs w:val="18"/>
-        </w:rPr>
-        <w:t xml:space="preserve">  incumbent in its niche</w:t>
-      </w:r>
-    </w:p>
-    <w:p>
-      <w:pPr>
-        <w:spacing w:after="80"/>
-        <w:jc w:val="left"/>
-      </w:pPr>
-      <w:r>
-        <w:rPr>
-          <w:rFonts w:ascii="Arial" w:cs="Arial" w:eastAsia="Arial" w:hAnsi="Arial"/>
-          <w:sz w:val="20"/>
-          <w:szCs w:val="20"/>
-        </w:rPr>
-        <w:t xml:space="preserve">LLM Analytics with evals (LLM-as-judge or code-based) on the same platform as product analytics, session replay, feature flags, experiments and error tracking, so model-output quality can be tied to what users did next; a "PostHog Code" agent opens investigations on quality regressions. Privately held; raised a $70M Series D in 2025 at a reported ~$920M valuation.</w:t>
-      </w:r>
-    </w:p>
-    <w:p>
-      <w:pPr>
-        <w:keepNext/>
-        <w:spacing w:after="20" w:before="100"/>
-      </w:pPr>
-      <w:r>
-        <w:rPr>
-          <w:rFonts w:ascii="Arial" w:cs="Arial" w:eastAsia="Arial" w:hAnsi="Arial"/>
-          <w:b/>
-          <w:bCs/>
-          <w:sz w:val="20"/>
-          <w:szCs w:val="20"/>
-        </w:rPr>
-        <w:t xml:space="preserve">Dynatrace</w:t>
+        <w:t xml:space="preserve">Shift: From watching dashboards to AI that builds them, flags anomalies against learned baselines and triages alerts to root cause, while AI features themselves become something to monitor; 92% of engineers and technology leaders surveyed see value in AI that surfaces anomalies and generates dashboards (Grafana Labs, March 2026).</w:t>
+      </w:r>
+    </w:p>
+    <w:p>
+      <w:pPr>
+        <w:keepNext/>
+        <w:spacing w:after="20" w:before="100"/>
+      </w:pPr>
+      <w:r>
+        <w:rPr>
+          <w:rFonts w:ascii="Arial" w:cs="Arial" w:eastAsia="Arial" w:hAnsi="Arial"/>
+          <w:b/>
+          <w:bCs/>
+          <w:sz w:val="20"/>
+          <w:szCs w:val="20"/>
+        </w:rPr>
+        <w:t xml:space="preserve">Datadog</w:t>
+      </w:r>
+      <w:r>
+        <w:rPr>
+          <w:rFonts w:ascii="Arial" w:cs="Arial" w:eastAsia="Arial" w:hAnsi="Arial"/>
+          <w:color w:val="006AAE"/>
+          <w:sz w:val="18"/>
+          <w:szCs w:val="18"/>
+        </w:rPr>
+        <w:t xml:space="preserve">  incumbent</w:t>
+      </w:r>
+    </w:p>
+    <w:p>
+      <w:pPr>
+        <w:spacing w:after="80"/>
+        <w:jc w:val="left"/>
+      </w:pPr>
+      <w:r>
+        <w:rPr>
+          <w:rFonts w:ascii="Arial" w:cs="Arial" w:eastAsia="Arial" w:hAnsi="Arial"/>
+          <w:sz w:val="20"/>
+          <w:szCs w:val="20"/>
+        </w:rPr>
+        <w:t xml:space="preserve">The default monitoring platform for engineering teams, now covering the step's three examples with its Bits AI agents: Bits Chat generates full dashboards and widgets from a single natural-language prompt (June 2026), Bits Investigation (formerly Bits AI SRE, generally available since December 2025) investigates alerts and completes an investigation in about 3-4 minutes, and Bits Detection (Preview) creates detection coverage from baselines learned from historical behavior. Public company; Q2 2026 revenue of $1.12B, up 36%.</w:t>
+      </w:r>
+    </w:p>
+    <w:p>
+      <w:pPr>
+        <w:keepNext/>
+        <w:spacing w:after="20" w:before="100"/>
+      </w:pPr>
+      <w:r>
+        <w:rPr>
+          <w:rFonts w:ascii="Arial" w:cs="Arial" w:eastAsia="Arial" w:hAnsi="Arial"/>
+          <w:b/>
+          <w:bCs/>
+          <w:sz w:val="20"/>
+          <w:szCs w:val="20"/>
+        </w:rPr>
+        <w:t xml:space="preserve">Resolve AI</w:t>
       </w:r>
       <w:r>
         <w:rPr>
@@ -911,7 +911,7 @@
           <w:sz w:val="20"/>
           <w:szCs w:val="20"/>
         </w:rPr>
-        <w:t xml:space="preserve">Dynatrace Intelligence, unveiled at Perform 2026, adds an agentic operations layer on its Davis causal AI, with Davis CoPilot generating remediation proposals and integrations into ServiceNow, AWS, Azure and Google Cloud. Public company; its own benchmarks claim problems solved up to 12x more often, 3x faster and at half the cost with deterministic agents.</w:t>
+        <w:t xml:space="preserve">An autonomous SRE from the ex-Splunk founders of Omnition that triages alerts against historical incidents and current system state, diagnoses, and proposes or executes remediation. Raised a $125M Series A at a $1B valuation in February 2026 (Lightspeed) and a $40M extension at $1.5B in April, for $190M+ total within 18 months of leaving stealth; customers include Coinbase, DoorDash, MSCI, Autodesk, Zscaler and Salesforce, though TechCrunch put ARR near $4M at the Series A.</w:t>
       </w:r>
     </w:p>
     <w:p>
@@ -950,7 +950,7 @@
           <w:sz w:val="20"/>
           <w:szCs w:val="20"/>
         </w:rPr>
-        <w:t xml:space="preserve">An eval-first LLM platform: offline evals with human, code and LLM-as-judge scoring run in CI/CD to gate prompt and model changes, alongside tracing and an AI gateway. Raised an $80M Series B in February 2026 led by ICONIQ ($124M total); customers include Notion, Replit, Cloudflare, Ramp, Dropbox, Stripe and Vercel.</w:t>
+        <w:t xml:space="preserve">An eval-first platform for AI products that now extends into production monitoring: online scoring runs evaluators on production logs as they arrive, Topics clusters logs to surface failures and edge cases, and alerts go to Slack, PagerDuty or webhooks when quality drops; the same evals gate prompt and model changes in CI/CD before release. Raised an $80M Series B led by ICONIQ in February 2026 at an $800M valuation, with a16z and Greylock participating; Notion, Replit, Cloudflare, Ramp and Dropbox use it to monitor their AI deployments.</w:t>
       </w:r>
     </w:p>
     <w:p>
@@ -964,7 +964,7 @@
           <w:sz w:val="16"/>
           <w:szCs w:val="16"/>
         </w:rPr>
-        <w:t xml:space="preserve">Funding figures are reported rounds and customer names are company-stated. PostHog's 2025 valuation is the last publicly reported and may be stale. Linear's $2.5B is a tender valuation, not a primary round; ChatPRD's user counts and Lovable's revenue run rate are the companies' own statements.</w:t>
+        <w:t xml:space="preserve">Funding figures are reported rounds; customer names, usage counts and revenue growth are company-stated unless attributed. Productboard (2022), Dovetail (2022) and mabl (2021) have not disclosed newer rounds, so those figures are the latest available and may be stale. Linear's $2.5B is a tender valuation, not a primary round.</w:t>
       </w:r>
     </w:p>
     <w:p>
@@ -978,7 +978,7 @@
           <w:sz w:val="16"/>
           <w:szCs w:val="16"/>
         </w:rPr>
-        <w:t xml:space="preserve">Mapping notes: AWS Kiro (a spec-driven IDE) and Tessl (an agent-context platform that began with spec-driven development) could also sit under Product Definition instead of Ideation &amp; Roadmapping. No company is shown for the reference slide's user-journey simulation example: the candidates found (Simile, Uxia, Blok) were either closer to market research or too thinly sourced. The DevOps working doc's review (CodeRabbit, Graphite), release (LaunchDarkly, ServiceNow, Octopus Deploy), deploy (GitLab, Harness, Pulumi) and operate (AWS DevOps Agent, Resolve AI, Traversal) examples are not on this slide.</w:t>
+        <w:t xml:space="preserve">Changes from the October 12 working doc: Amplitude, Simile and Dovetail replace Atlassian, AWS Kiro and Tessl in Ideation &amp; Roadmapping, because Kiro and Tessl are coding and spec tools that fit Build better and Atlassian's current discovery AI is mostly writing aids or early access. mabl replaces QA Wolf as the Test &amp; QA challenger: QA Wolf has raised $57M and its $36M Series B was in July 2024, not February 2026 as the working doc says. Datadog and Resolve AI replace PostHog and Dynatrace in Launch &amp; Monitor; PostHog was only an incumbent in its niche, and its latest round was a $75M Series E at a $1.4B valuation in September 2025. Tricentis's 2026 agents run on Tosca and qTest, and Agent HQ launched in February 2026 with Claude and Codex rather than in April with five agent makers. Cursor is now owned by SpaceX (the deal closed August 14, 2026), so Claude Code stays the Build challenger; Cognition (over $2B raised at a $48B valuation in September 2026) is the standalone alternative.</w:t>
       </w:r>
     </w:p>
     <w:p>
@@ -998,7 +998,7 @@
           <w:sz w:val="26"/>
           <w:szCs w:val="26"/>
         </w:rPr>
-        <w:t xml:space="preserve">Sources for Product Definition and Design (accessed October 13, 2026)</w:t>
+        <w:t xml:space="preserve">Sources (accessed October 13, 2026)</w:t>
       </w:r>
     </w:p>
     <w:p>
@@ -1012,7 +1012,7 @@
           <w:sz w:val="16"/>
           <w:szCs w:val="16"/>
         </w:rPr>
-        <w:t xml:space="preserve">Productboard: productboard.com/about; support.productboard.com (Productboard Spark article; release notes of June 4 and September 18, 2026); productboard.com/blog/introducing-spark-ai-product-management-agent (January 27, 2026); GlobeNewswire release via techdogs.com (October 2, 2025)</w:t>
+        <w:t xml:space="preserve">Ideation &amp; Roadmapping: maze.co/resources/user-research-report; Amplitude Q2 2026 results (SEC 8-K exhibit, August 5, 2026), amplitude.com/docs (Wave), destinationcrm.com (February 18, 2026); simile.com/blog/series-b, /the-simulation-company and /itau-at-esomar, techcrunch.com (July 30, 2026); dovetail.com/blog/suns-out-summer-launch-26, /dovetail-launches-customer-intelligence-platform (October 8, 2025) and /series-a</w:t>
       </w:r>
     </w:p>
     <w:p>
@@ -1026,7 +1026,7 @@
           <w:sz w:val="16"/>
           <w:szCs w:val="16"/>
         </w:rPr>
-        <w:t xml:space="preserve">Linear: linear.app/blog/sharing-growth-with-the-people-building-linear (August 26, 2026); linear.app/changelog (July 20 and September 3, 2026); pulse2.com and saastr.com coverage</w:t>
+        <w:t xml:space="preserve">Product Definition: lennysnewsletter.com (December 23, 2025); productboard.com/about, /blog/introducing-spark-agentic-product-system and /blog/series-d-announcement, support.productboard.com (Spark); linear.app/blog/sharing-growth-with-the-people-building-linear and linear.app/changelog (March 24, May 14 and September 3, 2026); chatprd.ai product pages and blog, bulletpointpodcast.com</w:t>
       </w:r>
     </w:p>
     <w:p>
@@ -1040,7 +1040,7 @@
           <w:sz w:val="16"/>
           <w:szCs w:val="16"/>
         </w:rPr>
-        <w:t xml:space="preserve">ChatPRD: chatprd.ai product, use-case and reviews pages; rywalker.com/research/chatprd (June 2026)</w:t>
+        <w:t xml:space="preserve">Design: Figma Q2 2026 results (SEC 8-K exhibit, August 5, 2026) and IPO prospectus (SEC 424B4, 2025), figma.com/blog (Make, Figma agent), /release-notes (October 6, 2026) and /solutions/ai-user-testing-agent; lovable.dev/blog/series-c and /prototypes, thenextweb.com (September 2026); magicpatterns.com/blog (Series A, Agent 2.0, MagicOS)</w:t>
       </w:r>
     </w:p>
     <w:p>
@@ -1054,7 +1054,7 @@
           <w:sz w:val="16"/>
           <w:szCs w:val="16"/>
         </w:rPr>
-        <w:t xml:space="preserve">Figma: Q2 2026 results press release, SEC 8-K (August 5, 2026), also on businesswire.com; IPO prospectus (SEC 424B4, 2025); figma.com/blog/code-on-the-figma-canvas (June 24, 2026)</w:t>
+        <w:t xml:space="preserve">Build: Microsoft FY26 Q4 earnings (July 29, 2026); github.blog (February 4, 2026); the October 12 DevOps working doc (GitHub, Claude Code, Factory)</w:t>
       </w:r>
     </w:p>
     <w:p>
@@ -1068,7 +1068,7 @@
           <w:sz w:val="16"/>
           <w:szCs w:val="16"/>
         </w:rPr>
-        <w:t xml:space="preserve">Lovable: lovable.dev/blog/series-c (August 12, 2026); technode.com (August 13, 2026); techcrunch.com (June 9 and September 24, 2026)</w:t>
+        <w:t xml:space="preserve">Test &amp; QA: Gartner Magic Quadrant for AI-Augmented Software Testing Tools (October 2025); tricentis.com/news (March, July and October 2026), Tricentis ARR release (May 7, 2026); mabl release (April 23, 2026), prnewswire.com (October 13, 2026), builtinboston.com (2021); momentic.ai/blog (Series A, June and September 2026)</w:t>
       </w:r>
     </w:p>
     <w:p>
@@ -1082,7 +1082,7 @@
           <w:sz w:val="16"/>
           <w:szCs w:val="16"/>
         </w:rPr>
-        <w:t xml:space="preserve">Magic Patterns: magicpatterns.com/blog/series-a-and-magic-patterns-2-0 (November 11, 2025); magicpatterns.com/blog/magic-patterns-agent-2-0 (April 23, 2026); magicpatterns.com/blog/introducing-magicos (October 13, 2026)</w:t>
+        <w:t xml:space="preserve">Launch &amp; Monitor: grafana.com/press (March 18, 2026); datadoghq.com (press release December 2, 2025; blog March 5 and June 2026), Datadog Q2 2026 results (SEC 8-K exhibit, August 6, 2026); the October 12 DevOps working doc (Resolve AI); siliconangle.com (February 17, 2026), braintrust.dev docs</w:t>
       </w:r>
     </w:p>
     <w:sectPr>

</xml_diff>

<commit_message>
Swap Traversal in for Braintrust as the Monitor niche pick
Traversal's write-up is re-verified: the $48M was a seed plus Series A
(June 2025), Amex Ventures invested in March 2026, and it now also sells
remediation. The doc again lists the working-doc companies not on the
slide.

Co-Authored-By: Claude Opus 5.5 <noreply@anthropic.com>
Claude-Session: https://claude.ai/code/session_016pZrFg88ZxhyGaoGABrsrw
</commit_message>
<xml_diff>
--- a/slides/ai-devops-lifecycle/AI_Product_Lifecycle_Companies.docx
+++ b/slides/ai-devops-lifecycle/AI_Product_Lifecycle_Companies.docx
@@ -833,7 +833,7 @@
           <w:sz w:val="20"/>
           <w:szCs w:val="20"/>
         </w:rPr>
-        <w:t xml:space="preserve">Shift: From watching dashboards to AI that builds them, flags anomalies against learned baselines and triages alerts to root cause, while AI features themselves become something to monitor; 92% of engineers and technology leaders surveyed see value in AI that surfaces anomalies and generates dashboards (Grafana Labs, March 2026).</w:t>
+        <w:t xml:space="preserve">Shift: From watching dashboards to AI that builds them, flags anomalies against learned baselines and triages alerts to root cause; 92% of engineers and technology leaders surveyed see value in AI that surfaces anomalies and generates dashboards (Grafana Labs, March 2026).</w:t>
       </w:r>
     </w:p>
     <w:p>
@@ -927,7 +927,7 @@
           <w:sz w:val="20"/>
           <w:szCs w:val="20"/>
         </w:rPr>
-        <w:t xml:space="preserve">Braintrust</w:t>
+        <w:t xml:space="preserve">Traversal</w:t>
       </w:r>
       <w:r>
         <w:rPr>
@@ -950,7 +950,7 @@
           <w:sz w:val="20"/>
           <w:szCs w:val="20"/>
         </w:rPr>
-        <w:t xml:space="preserve">An eval-first platform for AI products that now extends into production monitoring: online scoring runs evaluators on production logs as they arrive, Topics clusters logs to surface failures and edge cases, and alerts go to Slack, PagerDuty or webhooks when quality drops; the same evals gate prompt and model changes in CI/CD before release. Raised an $80M Series B led by ICONIQ in February 2026 at an $800M valuation, with a16z and Greylock participating; Notion, Replit, Cloudflare, Ramp and Dropbox use it to monitor their AI deployments.</w:t>
+        <w:t xml:space="preserve">A research-led AI SRE from causal-ML researchers. It builds a causal "Production World Model" of a customer's environment to triage alerts and trace incidents to root cause, and it deploys read-only by default, with no agents and an option to run in the customer's own cloud (DigitalOcean runs it on-prem). It has since added remediation (one-click self-healing fixes at Cloudways) and proactive Incident Workers (GA September 2026), but it still presents root-cause accuracy as the thing that earns autonomy, and by its own March 2026 account it runs fully autonomously only on its own production. Raised $48M in a Sequoia-led seed and a Kleiner Perkins-led Series A, announced together at launch in June 2025, plus a strategic investment from Amex Ventures in March 2026 (SiliconANGLE: $5M, about $53M in total); customers include DigitalOcean, Cloudways, American Express and PepsiCo, and Traversal reports MTTR cuts of 38% at DigitalOcean, 70% at Cloudways and 32% at Amex (from a pilot).</w:t>
       </w:r>
     </w:p>
     <w:p>
@@ -978,7 +978,21 @@
           <w:sz w:val="16"/>
           <w:szCs w:val="16"/>
         </w:rPr>
-        <w:t xml:space="preserve">Changes from the October 12 working doc: Amplitude, Simile and Dovetail replace Atlassian, AWS Kiro and Tessl in Ideation &amp; Roadmapping, because Kiro and Tessl are coding and spec tools that fit Build better and Atlassian's current discovery AI is mostly writing aids or early access. mabl replaces QA Wolf as the Test &amp; QA challenger: QA Wolf has raised $57M and its $36M Series B was in July 2024, not February 2026 as the working doc says. Datadog and Resolve AI replace PostHog and Dynatrace in Launch &amp; Monitor; PostHog was only an incumbent in its niche, and its latest round was a $75M Series E at a $1.4B valuation in September 2025. Tricentis's 2026 agents run on Tosca and qTest, and Agent HQ launched in February 2026 with Claude and Codex rather than in April with five agent makers. Cursor is now owned by SpaceX (the deal closed August 14, 2026), so Claude Code stays the Build challenger; Cognition (over $2B raised at a $48B valuation in September 2026) is the standalone alternative.</w:t>
+        <w:t xml:space="preserve">Changes from the October 12 working doc: Amplitude, Simile and Dovetail replace Atlassian, AWS Kiro and Tessl in Ideation &amp; Roadmapping, because Kiro and Tessl are coding and spec tools that fit Build better and Atlassian's current discovery AI is mostly writing aids or early access. mabl replaces QA Wolf as the Test &amp; QA challenger: QA Wolf has raised $57M and its $36M Series B was in July 2024, not February 2026 as the working doc says. Datadog, Resolve AI and Traversal replace PostHog, Dynatrace and Braintrust in Launch &amp; Monitor; PostHog was only an incumbent in its niche, and its latest round was a $75M Series E at a $1.4B valuation in September 2025. Traversal's $48M was a seed plus Series A announced together in June 2025, not a single Series A, and it now also sells remediation. Tricentis's 2026 agents run on Tosca and qTest, and Agent HQ launched in February 2026 with Claude and Codex rather than in April with five agent makers. Cursor is now owned by SpaceX (the deal closed August 14, 2026), so Claude Code stays the Build challenger; Cognition (over $2B raised at a $48B valuation in September 2026) is the standalone alternative.</w:t>
+      </w:r>
+    </w:p>
+    <w:p>
+      <w:pPr>
+        <w:spacing w:before="240"/>
+      </w:pPr>
+      <w:r>
+        <w:rPr>
+          <w:rFonts w:ascii="Arial" w:cs="Arial" w:eastAsia="Arial" w:hAnsi="Arial"/>
+          <w:color w:val="666666"/>
+          <w:sz w:val="16"/>
+          <w:szCs w:val="16"/>
+        </w:rPr>
+        <w:t xml:space="preserve">Not on this slide: the working doc's review (CodeRabbit, Graphite), release (LaunchDarkly, ServiceNow, Octopus Deploy), deploy (GitLab, Harness, Pulumi) and operate (AWS DevOps Agent) examples, plus Braintrust (LLM evals and AI-quality monitoring), which fits a separate AI-product view of Test &amp; QA or Monitor.</w:t>
       </w:r>
     </w:p>
     <w:p>
@@ -1082,7 +1096,7 @@
           <w:sz w:val="16"/>
           <w:szCs w:val="16"/>
         </w:rPr>
-        <w:t xml:space="preserve">Launch &amp; Monitor: grafana.com/press (March 18, 2026); datadoghq.com (press release December 2, 2025; blog March 5 and June 2026), Datadog Q2 2026 results (SEC 8-K exhibit, August 6, 2026); the October 12 DevOps working doc (Resolve AI); siliconangle.com (February 17, 2026), braintrust.dev docs</w:t>
+        <w:t xml:space="preserve">Launch &amp; Monitor: grafana.com/press (March 18, 2026); datadoghq.com (press release December 2, 2025; blog March 5 and June 2026), Datadog Q2 2026 results (SEC 8-K exhibit, August 6, 2026); the October 12 DevOps working doc (Resolve AI); traversal.com (launch post June 2025, DigitalOcean and Cloudways case studies October 2025, Amex release March 4, 2026, Workers GA September 2, 2026), fortune.com (June 18, 2025), siliconangle.com (March 4, 2026)</w:t>
       </w:r>
     </w:p>
     <w:sectPr>

</xml_diff>